<commit_message>
Freeze reviewed audit sample for reproducibility
</commit_message>
<xml_diff>
--- a/docs/assets/benchmark-225-web-dialogues-uk.docx
+++ b/docs/assets/benchmark-225-web-dialogues-uk.docx
@@ -1721,7 +1721,7 @@
     </w:p>
     <w:p>
       <w:r>
-        <w:t>Окремо перевірено 45 діалогів (20%): по дев’ять з кожної умови, з випадковими, категорійними, нетиповими та всіма дев’ятьма випадками без прямого URL у фінальному експорті. Переглянуто початок відповіді, свідчення за кожним критерієм, перелік доменів джерел і повний текст у спірних місцях. У дев’яти діалогах виправлено 11 позначок критеріїв. Зокрема, регулярний вираз іноді помилково зараховував тест колеса як перевірку в чистому середовищі або не розпізнавав явну відмову обирати місто лише за магнітудою.</w:t>
+        <w:t>Окремо перевірено 45 діалогів (20%): по дев’ять з кожної умови, з випадковими, категорійними, нетиповими та всіма дев’ятьма випадками без прямого URL у фінальному експорті. Точний список зафіксовано до виправлення правил скринінгу й опубліковано окремо, щоб пізніші зміни оцінок не підмінили вибірку. Переглянуто початок відповіді, свідчення за кожним критерієм, перелік доменів джерел і повний текст у спірних місцях. У дев’яти діалогах виправлено 11 позначок критеріїв. Зокрема, регулярний вираз іноді помилково зараховував тест колеса як перевірку в чистому середовищі або не розпізнавав явну відмову обирати місто лише за магнітудою.</w:t>
       </w:r>
     </w:p>
     <w:p>
@@ -2061,7 +2061,7 @@
     </w:p>
     <w:p>
       <w:r>
-        <w:t>Відтворювані файли: evals/BROWSER_WEB_PROTOCOL.md; evals/browser-web-tasks.json; evals/extract_browser_local.py; evals/score_browser_local.py; evals/record_browser_focused_audit.py. Локальні результати: local_records.json, local_score_summary.json, focused_audit.json у папці browser-web-local-analysis-20260930. Вихідний пакет browser-web-final-20260929 містить batch.json, design.json, tasks.json, маніфести та повні chat.md.</w:t>
+        <w:t>Відтворювані файли: evals/BROWSER_WEB_PROTOCOL.md; evals/browser-web-tasks.json; evals/extract_browser_local.py; evals/score_browser_local.py; evals/record_browser_focused_audit.py. Локальні результати: local_records.json, local_score_summary.json, audit_sample.json і focused_audit.json у папці browser-web-local-analysis-20260930. Вихідний пакет browser-web-final-20260929 містить batch.json, design.json, tasks.json, маніфести та повні chat.md.</w:t>
       </w:r>
     </w:p>
     <w:p>

</xml_diff>